<commit_message>
feat: migrate CineShelf to Next.js and add movie workspace UI
</commit_message>
<xml_diff>
--- a/docs/CineShelf-Proposal.docx
+++ b/docs/CineShelf-Proposal.docx
@@ -57,7 +57,7 @@
     </w:p>
     <w:p>
       <w:r>
-        <w:t>โครงการ CineShelf จึงเสนอการพัฒนาเว็บแอปพลิเคชันที่รวมการค้นหาข้อมูลภาพยนตร์และการจัดเก็บหนังส่วนตัวไว้ในที่เดียว ผู้ใช้สามารถค้นหาหนังจาก The Movie Database (TMDB) บันทึกหนังที่สนใจ จัดหมวดหมู่ตามความต้องการ และแชร์ลิงก์ห้องสมุดให้เพื่อนเปิดดูได้ โดยออกแบบหน้าตาโทนมืดให้สื่อถึงบรรยากาศโรงภาพยนตร์และรองรับการใช้งานบนมือถือ</w:t>
+        <w:t>โครงการ CineShelf เสนอเว็บแอปพลิเคชันค้นหาภาพยนตร์ทุกประเภทจาก TMDB และบันทึกหนังที่ถูกใจหรืออยากดูไว้ในบัญชีส่วนตัว พร้อมแชร์โปรไฟล์ให้เพื่อนเห็นหนังที่ถูกใจ โดยออกแบบ UI ที่ได้แรงบันดาลใจจาก Spotify โทนมืดและรองรับมือถือ ไม่จำกัดเฉพาะ Studio Ghibli</w:t>
       </w:r>
     </w:p>
     <w:p>
@@ -73,7 +73,7 @@
         <w:pStyle w:val="ListBullet"/>
       </w:pPr>
       <w:r>
-        <w:t>เพื่อพัฒนาเว็บแอปพลิเคชันด้วย React โดยประยุกต์ใช้ Components, Props, State, Hooks, Context และ React Router</w:t>
+        <w:t>เพื่อพัฒนาเว็บแอปพลิเคชันด้วย Next.js App Router และ React โดยใช้ Components, Props, State, Hooks และ Context พร้อม Next.js Route Handlers สำหรับ API ในเซิร์ฟเวอร์เดียวกัน</w:t>
       </w:r>
     </w:p>
     <w:p>
@@ -97,7 +97,7 @@
         <w:pStyle w:val="ListBullet"/>
       </w:pPr>
       <w:r>
-        <w:t>เพื่อให้สมาชิกแชร์รายการหนังให้เพื่อนดูผ่านลิงก์ และควบคุมการเปิด–ปิดการแชร์ได้</w:t>
+        <w:t>เพื่อให้สมาชิกแชร์โปรไฟล์ที่แสดงหนังที่ถูกใจผ่านลิงก์ และเลือกความเป็นสาธารณะหรือส่วนตัวได้</w:t>
       </w:r>
     </w:p>
     <w:p>
@@ -110,7 +110,7 @@
     </w:p>
     <w:p>
       <w:r>
-        <w:t>นักศึกษาและบุคคลทั่วไปที่ชื่นชอบภาพยนตร์ ต้องการเก็บรายชื่อหนังที่อยากดู บันทึกความรู้สึกหลังรับชม หรือรวบรวมหนังที่ชอบเพื่อแนะนำให้เพื่อน โดยผู้รับลิงก์สามารถเปิดดูห้องสมุดที่แชร์ได้โดยไม่ต้องสมัครสมาชิก</w:t>
+        <w:t>นักศึกษาและบุคคลทั่วไปที่ชื่นชอบภาพยนตร์ ต้องการเก็บรายชื่อหนังที่อยากดูหรือรวบรวมเรื่องที่ชอบเพื่อแนะนำเพื่อน ผู้รับลิงก์เปิดโปรไฟล์สาธารณะได้โดยไม่ต้องสมัครสมาชิก</w:t>
       </w:r>
     </w:p>
     <w:p>
@@ -123,12 +123,12 @@
     </w:p>
     <w:p>
       <w:r>
-        <w:t>5.1 การค้นพบภาพยนตร์ — แสดงหนังยอดนิยม หนังที่กำลังเป็นกระแส หนังคะแนนสูง หนังที่กำลังฉาย และหนังที่กำลังจะเข้าฉาย พร้อมค้นหาด้วยชื่อ กรองประเภทในหน้าสำรวจ และแบ่งหน้ารายการ</w:t>
+        <w:t>5.1 การค้นพบภาพยนตร์ — แสดงหนังยอดนิยม หนังมาแรง คะแนนสูง กำลังฉาย และเร็ว ๆ นี้ ค้นหาชื่อ กรองประเภท ปีที่ฉาย และภาษาต้นฉบับ เรียงลำดับและแบ่งหน้า โดยเก็บคำค้นและตัวกรองใน URL</w:t>
       </w:r>
     </w:p>
     <w:p>
       <w:r>
-        <w:t>5.2 รายละเอียดภาพยนตร์ — แสดงโปสเตอร์ ชื่อหนัง ปีที่ฉาย เรื่องย่อ ประเภท ระยะเวลา คะแนนจาก TMDB นักแสดง และลิงก์ตัวอย่างหนังเมื่อแหล่งข้อมูลมีให้</w:t>
+        <w:t>5.2 รายละเอียดภาพยนตร์ — แสดงโปสเตอร์ ชื่อหนัง ปี เรื่องย่อ ประเภท ระยะเวลา คะแนนจาก TMDB นักแสดง และตัวอย่างหนังเมื่อมีข้อมูล พร้อมเลือกตัวอย่างผ่านแถบด้านล่างและเปิดวิดีโอในหน้าต่างตัวอย่าง</w:t>
       </w:r>
     </w:p>
     <w:p>
@@ -138,22 +138,22 @@
     </w:p>
     <w:p>
       <w:r>
-        <w:t>5.4 ห้องสมุดส่วนตัว — เพิ่มหรือลบหนัง ค้นหาภายในห้องสมุด ระบุสถานะ “อยากดู” หรือ “ดูแล้ว” ทำเครื่องหมายเรื่องโปรด ให้คะแนนส่วนตัว เขียนรีวิวสั้น และจัดเพลย์ลิสต์ของตนเอง</w:t>
+        <w:t>5.4 ห้องสมุดส่วนตัว — แยกแท็บ “ถูกใจ” และ “อยากดู” เพิ่มหรือลบหนัง ค้นหาภายในห้องสมุด และเรียงตามรายการล่าสุดหรือชื่อ บันทึกใน Supabase แยกตามบัญชีและคงอยู่หลังรีเฟรช</w:t>
       </w:r>
     </w:p>
     <w:p>
       <w:r>
-        <w:t>5.5 การแชร์ — สมาชิกเปิดแชร์ห้องสมุดและคัดลอกลิงก์ได้ ผู้รับลิงก์เห็นชื่อเจ้าของและรายชื่อหนังแบบอ่านอย่างเดียว เจ้าของปิดแชร์เพื่อยกเลิกลิงก์เดิมได้</w:t>
+        <w:t>5.5 การแชร์ — คัดลอกลิงก์ประจำตัว /u/[username] จากหน้าตั้งค่า โปรไฟล์เริ่มต้นเป็นส่วนตัว เมื่อเปิดสาธารณะผู้รับลิงก์เห็นเฉพาะหนังที่ถูกใจแบบอ่านอย่างเดียว ไม่เห็นอีเมลหรือรายการอยากดู การเปลี่ยนเป็นส่วนตัวไม่เปลี่ยนลิงก์ แต่ปิดสิทธิ์การอ่านของคนอื่น</w:t>
       </w:r>
     </w:p>
     <w:p>
       <w:r>
-        <w:t>5.6 การใช้งาน — รองรับหน้าจอคอมพิวเตอร์และมือถือ มีสถานะกำลังโหลด ข้อผิดพลาด ไม่พบผลลัพธ์ ห้องสมุดว่าง และหน้า 404</w:t>
+        <w:t>5.6 การใช้งาน — เดสก์ท็อปมีห้องสมุดซ้าย คอลเลกชันกลาง และรายละเอียดหนังขวา โดยคอลัมน์ข้างกว้างเท่ากัน ช่องค้นหาด้านบน แถบตัวอย่างด้านล่าง มือถือมีเมนูด้านล่าง พร้อม loading/error/empty/404 และไอคอน Flaticon Uicons ที่มีเครดิต</w:t>
       </w:r>
     </w:p>
     <w:p>
       <w:r>
-        <w:t>ขอบเขตที่ไม่รวม: การรับชมภาพยนตร์เต็มเรื่อง การซื้อบัตรหรือชำระเงิน ระบบแชต และการแนะนำหนังด้วยปัญญาประดิษฐ์ โดยคะแนนส่วนตัวและรีวิวไม่ถูกเผยแพร่ไปยัง TMDB</w:t>
+        <w:t>ขอบเขตที่ไม่รวม: คะแนนส่วนตัว รีวิว สถานะดูแล้ว เพลย์ลิสต์ ห้องสมุดสำหรับ guest การรับชมหนังเต็มเรื่อง การซื้อบัตรหรือชำระเงิน แชต และระบบแนะนำด้วย AI รายการแนะนำใช้ข้อมูล TMDB</w:t>
       </w:r>
     </w:p>
     <w:p>
@@ -166,17 +166,17 @@
     </w:p>
     <w:p>
       <w:r>
-        <w:t>หน้าจอหลักประกอบด้วย หน้าแรก หน้าสำรวจหนัง หน้ารายละเอียดหนัง หน้าสมัครสมาชิก หน้าเข้าสู่ระบบ หน้าห้องสมุดส่วนตัว หน้าแชร์ห้องสมุด และหน้าเกี่ยวกับเว็บไซต์</w:t>
+        <w:t>หน้าจอใช้ Next.js App Router: /, /movies, /movies/[id], /register, /login, /library, /settings/profile, /u/[username], /about และหน้า not-found สำหรับเส้นทางที่ไม่มีอยู่</w:t>
       </w:r>
     </w:p>
     <w:p>
       <w:r>
-        <w:t>ตัวอย่างการใช้งาน: ผู้ใช้เปิดเว็บ → ค้นหาหนัง → ดูรายละเอียด → เพิ่มเข้าห้องสมุด → จัดสถานะหรือเพลย์ลิสต์ → เข้าสู่ระบบเพื่อซิงก์รายการสำหรับแชร์ → เปิดแชร์และส่งลิงก์ → เพื่อนเปิดดูห้องสมุด</w:t>
+        <w:t>ตัวอย่างการใช้งาน: เปิดเว็บ → ค้นหาและกรองหนัง → ดูรายละเอียดหรือตัวอย่าง → สมัครหรือเข้าสู่ระบบ → ถูกใจหรือเพิ่มในอยากดู → เปิดห้องสมุด → ตั้งโปรไฟล์เป็นสาธารณะและคัดลอกลิงก์ → เพื่อนเปิดดูหนังที่ถูกใจ</w:t>
       </w:r>
     </w:p>
     <w:p>
       <w:r>
-        <w:t>ผู้ใช้ที่ยังไม่เข้าสู่ระบบสามารถทดลองจัดห้องสมุดในเบราว์เซอร์ได้ ส่วนการแชร์ผ่านเซิร์ฟเวอร์ใช้บัญชีสมาชิก การค้นหาตามชื่อจะทำงานเมื่อส่งฟอร์ม เพื่อลดการเรียก API ระหว่างพิมพ์</w:t>
+        <w:t>ผู้ที่ยังไม่เข้าสู่ระบบค้นหา ดูรายละเอียด และดูตัวอย่างหนังได้ แต่ต้องเข้าสู่ระบบก่อนบันทึกหนัง ช่องค้นหาด้านบนส่งคำค้นเมื่อกดค้นหา ส่วนช่องค้นหาหน้าสำรวจมี debounce เพื่อลดการเรียก API ระหว่างพิมพ์</w:t>
       </w:r>
     </w:p>
     <w:p>
@@ -189,27 +189,27 @@
     </w:p>
     <w:p>
       <w:r>
-        <w:t>Frontend: React และ Vite สำหรับสร้างเว็บแบบ Single Page Application, React Router สำหรับเปลี่ยนหน้า, CSS และ Tailwind CSS สำหรับหน้าตาและ Responsive Design</w:t>
+        <w:t>Framework: Next.js App Router และ React ใช้ file-based routes และ shared root layout; next/link และ next/navigation สำหรับเปลี่ยนหน้า ใช้ CSS สำหรับ UI และ Responsive Design โดยไม่มี Vite หรือ React Router</w:t>
       </w:r>
     </w:p>
     <w:p>
       <w:r>
-        <w:t>การจัดการข้อมูลและฟอร์ม: useState และ useEffect สำหรับสถานะและการทำงานตามวงจรของ Component, Context สำหรับข้อมูลที่ใช้หลายหน้า, Custom Hook สำหรับโหลดข้อมูล และ react-hook-form ร่วมกับ zod สำหรับตรวจสอบฟอร์ม</w:t>
+        <w:t>State และฟอร์ม: useState/useEffect, custom hook useFetch และ React Context 3 ตัว ได้แก่ AuthContext, LibraryContext และ PreviewContext ครอบแอปที่ src/app/providers.jsx; react-hook-form และ zod ตรวจสอบฟอร์ม</w:t>
       </w:r>
     </w:p>
     <w:p>
       <w:r>
-        <w:t>Backend: Node.js สำหรับจัดการบัญชี Session สิทธิ์การเข้าถึง และการรับส่งข้อมูลกับ TMDB โดยเก็บ API Key ใน Environment Variable ฝั่งเซิร์ฟเวอร์</w:t>
+        <w:t>API ฝั่งเซิร์ฟเวอร์: Next.js Route Handlers ให้บริการ /api/config, /api/genres, /api/movies และ /api/movies/[id] โดยเก็บ TMDB_API_KEY หรือ TMDB_READ_TOKEN ใน environment ฝั่งเซิร์ฟเวอร์ รันหน้าเว็บและ API ในเซิร์ฟเวอร์เดียวที่พอร์ต 5175</w:t>
       </w:r>
     </w:p>
     <w:p>
       <w:r>
-        <w:t>การจัดเก็บ: SQLite สำหรับบัญชี Session รายชื่อหนังที่ซิงก์ และสถานะการแชร์ ส่วนสถานะการดู คะแนน รีวิว และเพลย์ลิสต์จัดเก็บใน localStorage แยกตามผู้ใช้ในเบราว์เซอร์</w:t>
+        <w:t>การจัดเก็บและบัญชี: Supabase Auth จัดการบัญชี รหัสผ่าน และ session; Supabase PostgreSQL เก็บ profiles และ library_items โดย RLS บังคับสิทธิ์ ไม่ใช้ SQLite และไม่เก็บห้องสมุดใน localStorage</w:t>
       </w:r>
     </w:p>
     <w:p>
       <w:r>
-        <w:t>ภาษาและการตรวจสอบ: JavaScript/JSX สำหรับหน้า React และ TypeScript ในส่วนบริการข้อมูลกับรูปแบบข้อมูล ใช้ Automated Tests ตรวจฟังก์ชันสำคัญ และตรวจ Production Build ก่อนส่งงาน</w:t>
+        <w:t>ภาษาและการตรวจสอบ: JavaScript/JSX สำหรับ React และ TypeScript สำหรับบริการข้อมูล ใช้ npm test, npm run typecheck และ npm run build ร่วมกับการตรวจในเบราว์เซอร์ทั้งเดสก์ท็อปและมือถือ การทดสอบ RLS จริงใช้ environment สำหรับทดสอบโดยเฉพาะ</w:t>
       </w:r>
     </w:p>
     <w:p>
@@ -227,17 +227,17 @@
     </w:p>
     <w:p>
       <w:r>
-        <w:t>ลำดับการรับข้อมูล: React → Node.js API → TMDB → ส่งข้อมูลกลับมาแสดงผล ส่วนการสมัครสมาชิกและการแชร์อ่าน–เขียนข้อมูลผ่าน Node.js ไปยัง SQLite</w:t>
+        <w:t>ลำดับข้อมูลหนัง: React Client Components → Next.js Route Handlers → TMDB → แสดงผล ส่วนบัญชีใช้ Supabase Auth และโปรไฟล์/ห้องสมุดอ่าน–เขียนด้วย Supabase JS ภายใต้ RLS</w:t>
       </w:r>
     </w:p>
     <w:p>
       <w:r>
-        <w:t>ข้อมูลบัญชีประกอบด้วยชื่อที่แสดง อีเมล และค่าแฮชรหัสผ่าน ข้อมูลห้องสมุดเชื่อมผู้ใช้กับ Movie ID ส่วนข้อมูลการแชร์ประกอบด้วยสถานะเปิด–ปิดและ Token ของลิงก์ ผู้รับลิงก์ไม่เห็นอีเมลหรือข้อมูลเข้าสู่ระบบของเจ้าของ</w:t>
+        <w:t>profiles เก็บ id ที่สัมพันธ์กับ auth.users, username ไม่ซ้ำ, display_name, avatar_url และ is_public (เริ่มต้น false) โดยไม่เก็บอีเมล ส่วน library_items เก็บ user_id, tmdb_movie_id, kind (liked/watchlist), title และ poster_path พร้อม unique constraint ป้องกันรายการซ้ำ</w:t>
       </w:r>
     </w:p>
     <w:p>
       <w:r>
-        <w:t>ข้อมูลส่วนตัวใน localStorage เป็นข้อมูลของเบราว์เซอร์นั้น จึงยังไม่รวมการซิงก์คะแนน รีวิว และเพลย์ลิสต์ข้ามเครื่อง ส่วนรายการหนังที่แชร์จะอ้างอิงข้อมูลที่ซิงก์สำเร็จบนเซิร์ฟเวอร์</w:t>
+        <w:t>เจ้าของอ่านห้องสมุดของตนและเพิ่ม/ลบรายการได้ คนอื่นอ่านเฉพาะ liked ของโปรไฟล์สาธารณะและแก้ข้อมูลเจ้าของไม่ได้ การกดบันทึกใช้ optimistic update และย้อนค่าพร้อมแจ้งเตือนเมื่อบันทึกล้มเหลว ล็อกเอาต์ล้าง state เพื่อไม่ให้ข้อมูลปะปนข้ามบัญชี</w:t>
       </w:r>
     </w:p>
     <w:p>
@@ -266,7 +266,7 @@
         <w:pStyle w:val="ListBullet"/>
       </w:pPr>
       <w:r>
-        <w:t>ช่วงที่ 2: พัฒนาหน้า React การค้นหา รายการหนัง และรายละเอียด พร้อมเชื่อมต่อ TMDB</w:t>
+        <w:t>ช่วงที่ 2: พัฒนาหน้า Next.js App Router การค้นหา ตัวกรอง รายการและรายละเอียดหนัง พร้อม Route Handlers เชื่อม TMDB</w:t>
       </w:r>
     </w:p>
     <w:p>
@@ -274,7 +274,7 @@
         <w:pStyle w:val="ListBullet"/>
       </w:pPr>
       <w:r>
-        <w:t>ช่วงที่ 3: พัฒนาบัญชีผู้ใช้ ห้องสมุด สถานะการดู คะแนน รีวิว และเพลย์ลิสต์</w:t>
+        <w:t>ช่วงที่ 3: พัฒนาสมัคร/เข้าสู่ระบบด้วย Supabase Auth โปรไฟล์ และห้องสมุดถูกใจ/อยากดู พร้อม schema และ RLS</w:t>
       </w:r>
     </w:p>
     <w:p>
@@ -282,7 +282,7 @@
         <w:pStyle w:val="ListBullet"/>
       </w:pPr>
       <w:r>
-        <w:t>ช่วงที่ 4: พัฒนาการซิงก์รายชื่อหนังและการแชร์ ตรวจสิทธิ์การเข้าถึง และปรับหน้าจอมือถือ</w:t>
+        <w:t>ช่วงที่ 4: พัฒนาแชร์โปรไฟล์ UI แบบ Spotify ตัวอย่างหนัง ตรวจสิทธิ์และปรับหน้าจอมือถือ</w:t>
       </w:r>
     </w:p>
     <w:p>
@@ -330,7 +330,7 @@
         <w:pStyle w:val="ListBullet"/>
       </w:pPr>
       <w:r>
-        <w:t>คะแนน รีวิว และสถานะการดูแสดงตรงกับหนังที่เลือก และไม่ปะปนกับบัญชีอื่นในเบราว์เซอร์เดียวกัน</w:t>
+        <w:t>แท็บถูกใจและอยากดูแสดงรายการตรงกับบัญชี ไม่ปะปนเมื่อสลับบัญชี ข้อผิดพลาดการบันทึกย้อน optimistic state และแสดงแจ้งเตือน</w:t>
       </w:r>
     </w:p>
     <w:p>
@@ -338,7 +338,7 @@
         <w:pStyle w:val="ListBullet"/>
       </w:pPr>
       <w:r>
-        <w:t>ผู้รับลิงก์ที่ไม่ได้ล็อกอินเปิดดูห้องสมุดที่แชร์ได้ แก้ไขรายการของเจ้าของไม่ได้ และเปิดลิงก์เดิมไม่ได้หลังเจ้าของปิดแชร์</w:t>
+        <w:t>ผู้รับลิงก์ที่ไม่ได้ล็อกอินเปิดโปรไฟล์สาธารณะและเห็นเฉพาะหนังที่ถูกใจได้ ไม่เห็นอีเมลหรืออยากดู แก้รายการเจ้าของไม่ได้ และถูกปิดสิทธิ์เมื่อเจ้าของเปลี่ยนโปรไฟล์เป็นส่วนตัว</w:t>
       </w:r>
     </w:p>
     <w:p>
@@ -364,7 +364,7 @@
     </w:p>
     <w:p>
       <w:r>
-        <w:t>การแชร์ให้เพื่อนนอกเครือข่ายเดียวกันต้อง Deploy เซิร์ฟเวอร์และมีพื้นที่เก็บ SQLite แบบถาวร ลิงก์ localhost ใช้ได้เฉพาะเครื่องที่เปิดเว็บ ส่วนข้อมูลใน localStorage อาจหายเมื่อผู้ใช้ล้างข้อมูลเว็บไซต์</w:t>
+        <w:t>การแชร์นอกเครื่องต้อง deploy Next.js และตั้งค่าโดเมนใน Supabase ก่อน เว็บไซต์ยังไม่ได้ deploy; localhost เปิดได้เฉพาะเครื่องเจ้าของ บัญชีและรายการบันทึกอยู่ใน Supabase จึงไม่ต้องมีพื้นที่ SQLite ถาวรบนเว็บเซิร์ฟเวอร์</w:t>
       </w:r>
     </w:p>
     <w:p>
@@ -377,12 +377,12 @@
     </w:p>
     <w:p>
       <w:r>
-        <w:t>ได้เว็บแอปพลิเคชันที่ช่วยให้ผู้ใช้รวบรวมภาพยนตร์ที่สนใจ จัดระเบียบประสบการณ์การดูหนัง และแนะนำหนังให้เพื่อนผ่านลิงก์เดียว พร้อมได้ฝึกพัฒนา React เชื่อมต่อ API จัดการ State ตรวจสอบฟอร์ม และทำงานร่วมกับ Backend และฐานข้อมูล</w:t>
+        <w:t>ได้เว็บแอปพลิเคชันค้นหาภาพยนตร์ทุกประเภทและรวบรวมหนังที่ถูกใจหรืออยากดู พร้อมแชร์โปรไฟล์ผ่านลิงก์เดียว และได้ฝึก Next.js App Router, React, Route Handlers, API, State, ฟอร์ม และ Supabase Auth/PostgreSQL/RLS</w:t>
       </w:r>
     </w:p>
     <w:p>
       <w:r>
-        <w:t>สิ่งส่งมอบประกอบด้วย Source Code ของเว็บและเซิร์ฟเวอร์ ไฟล์ตั้งค่าตัวอย่างที่ไม่มีคีย์ลับ คู่มือการติดตั้งและใช้งาน เอกสารโครงการ และผลการทดสอบฟังก์ชันหลัก</w:t>
+        <w:t>สิ่งส่งมอบ: source code ของ Next.js, schema และ RLS ของ Supabase, .env.example ที่ไม่มีคีย์ลับ, คู่มือใช้งาน, Proposal และผลการทดสอบฟังก์ชันหลัก</w:t>
       </w:r>
     </w:p>
     <w:p>
@@ -406,6 +406,21 @@
     <w:p>
       <w:r>
         <w:t>TMDB API Authentication: https://developer.themoviedb.org/docs/authentication-application</w:t>
+      </w:r>
+    </w:p>
+    <w:p>
+      <w:r>
+        <w:t>Next.js App Router: https://nextjs.org/docs/app</w:t>
+      </w:r>
+    </w:p>
+    <w:p>
+      <w:r>
+        <w:t>Supabase Documentation: https://supabase.com/docs</w:t>
+      </w:r>
+    </w:p>
+    <w:p>
+      <w:r>
+        <w:t>Flaticon Uicons: https://www.flaticon.com/uicons</w:t>
       </w:r>
     </w:p>
     <w:sectPr>

</xml_diff>